<commit_message>
add laba3 new 1
</commit_message>
<xml_diff>
--- a/Lr3/Лаба3.docx
+++ b/Lr3/Лаба3.docx
@@ -2737,75 +2737,130 @@
           <w:sz w:val="24"/>
           <w:szCs w:val="24"/>
         </w:rPr>
-        <w:t xml:space="preserve">Итог: в ходе работы мною были приобретены новые знания работы с </w:t>
-      </w:r>
-      <w:proofErr w:type="spellStart"/>
-      <w:r>
-        <w:rPr>
-          <w:rFonts w:ascii="Times New Roman" w:hAnsi="Times New Roman" w:cs="Times New Roman"/>
-          <w:color w:val="000000"/>
-          <w:sz w:val="24"/>
-          <w:szCs w:val="24"/>
-          <w:lang w:val="en-US"/>
-        </w:rPr>
-        <w:t>Git</w:t>
-      </w:r>
-      <w:proofErr w:type="spellEnd"/>
-      <w:r>
-        <w:rPr>
-          <w:rFonts w:ascii="Times New Roman" w:hAnsi="Times New Roman" w:cs="Times New Roman"/>
-          <w:color w:val="000000"/>
-          <w:sz w:val="24"/>
-          <w:szCs w:val="24"/>
-        </w:rPr>
-        <w:t xml:space="preserve"> и загружены ранее созданные отчеты в </w:t>
-      </w:r>
-      <w:proofErr w:type="spellStart"/>
-      <w:r>
-        <w:rPr>
-          <w:rFonts w:ascii="Times New Roman" w:hAnsi="Times New Roman" w:cs="Times New Roman"/>
-          <w:sz w:val="24"/>
-          <w:szCs w:val="24"/>
-        </w:rPr>
-        <w:t>репозиторий</w:t>
-      </w:r>
-      <w:proofErr w:type="spellEnd"/>
-      <w:r>
-        <w:rPr>
-          <w:rFonts w:ascii="Times New Roman" w:hAnsi="Times New Roman" w:cs="Times New Roman"/>
-          <w:color w:val="000000"/>
-          <w:sz w:val="24"/>
-          <w:szCs w:val="24"/>
-        </w:rPr>
-        <w:t xml:space="preserve"> на </w:t>
-      </w:r>
-      <w:proofErr w:type="spellStart"/>
-      <w:r>
-        <w:rPr>
-          <w:rFonts w:ascii="Times New Roman" w:hAnsi="Times New Roman" w:cs="Times New Roman"/>
-          <w:color w:val="000000"/>
-          <w:sz w:val="24"/>
-          <w:szCs w:val="24"/>
-          <w:lang w:val="en-US"/>
-        </w:rPr>
-        <w:t>Git</w:t>
-      </w:r>
-      <w:proofErr w:type="spellEnd"/>
-      <w:r>
-        <w:rPr>
-          <w:rFonts w:ascii="Times New Roman" w:hAnsi="Times New Roman" w:cs="Times New Roman"/>
-          <w:color w:val="000000"/>
-          <w:sz w:val="24"/>
-          <w:szCs w:val="24"/>
-        </w:rPr>
-        <w:t>.</w:t>
+        <w:drawing>
+          <wp:inline distT="0" distB="0" distL="0" distR="0" wp14:anchorId="4359D5AA" wp14:editId="5D5345C2">
+            <wp:extent cx="5940425" cy="4530090"/>
+            <wp:effectExtent l="0" t="0" r="3175" b="3810"/>
+            <wp:docPr id="2" name="Рисунок 2"/>
+            <wp:cNvGraphicFramePr>
+              <a:graphicFrameLocks xmlns:a="http://schemas.openxmlformats.org/drawingml/2006/main" noChangeAspect="1"/>
+            </wp:cNvGraphicFramePr>
+            <a:graphic xmlns:a="http://schemas.openxmlformats.org/drawingml/2006/main">
+              <a:graphicData uri="http://schemas.openxmlformats.org/drawingml/2006/picture">
+                <pic:pic xmlns:pic="http://schemas.openxmlformats.org/drawingml/2006/picture">
+                  <pic:nvPicPr>
+                    <pic:cNvPr id="1" name=""/>
+                    <pic:cNvPicPr/>
+                  </pic:nvPicPr>
+                  <pic:blipFill>
+                    <a:blip r:embed="rId26"/>
+                    <a:stretch>
+                      <a:fillRect/>
+                    </a:stretch>
+                  </pic:blipFill>
+                  <pic:spPr>
+                    <a:xfrm>
+                      <a:off x="0" y="0"/>
+                      <a:ext cx="5940425" cy="4530090"/>
+                    </a:xfrm>
+                    <a:prstGeom prst="rect">
+                      <a:avLst/>
+                    </a:prstGeom>
+                  </pic:spPr>
+                </pic:pic>
+              </a:graphicData>
+            </a:graphic>
+          </wp:inline>
+        </w:drawing>
       </w:r>
       <w:bookmarkStart w:id="0" w:name="_GoBack"/>
       <w:bookmarkEnd w:id="0"/>
     </w:p>
+    <w:p>
+      <w:pPr>
+        <w:spacing w:line="240" w:lineRule="auto"/>
+        <w:ind w:left="-567"/>
+        <w:rPr>
+          <w:rFonts w:ascii="Times New Roman" w:hAnsi="Times New Roman" w:cs="Times New Roman"/>
+          <w:color w:val="000000"/>
+          <w:sz w:val="24"/>
+          <w:szCs w:val="24"/>
+        </w:rPr>
+      </w:pPr>
+      <w:r>
+        <w:rPr>
+          <w:rFonts w:ascii="Times New Roman" w:hAnsi="Times New Roman" w:cs="Times New Roman"/>
+          <w:color w:val="000000"/>
+          <w:sz w:val="24"/>
+          <w:szCs w:val="24"/>
+        </w:rPr>
+        <w:t xml:space="preserve">Итог: в ходе работы мною были приобретены новые знания работы с </w:t>
+      </w:r>
+      <w:proofErr w:type="spellStart"/>
+      <w:r>
+        <w:rPr>
+          <w:rFonts w:ascii="Times New Roman" w:hAnsi="Times New Roman" w:cs="Times New Roman"/>
+          <w:color w:val="000000"/>
+          <w:sz w:val="24"/>
+          <w:szCs w:val="24"/>
+          <w:lang w:val="en-US"/>
+        </w:rPr>
+        <w:t>Git</w:t>
+      </w:r>
+      <w:proofErr w:type="spellEnd"/>
+      <w:r>
+        <w:rPr>
+          <w:rFonts w:ascii="Times New Roman" w:hAnsi="Times New Roman" w:cs="Times New Roman"/>
+          <w:color w:val="000000"/>
+          <w:sz w:val="24"/>
+          <w:szCs w:val="24"/>
+        </w:rPr>
+        <w:t xml:space="preserve"> и загружены ранее созданные отчеты в </w:t>
+      </w:r>
+      <w:proofErr w:type="spellStart"/>
+      <w:r>
+        <w:rPr>
+          <w:rFonts w:ascii="Times New Roman" w:hAnsi="Times New Roman" w:cs="Times New Roman"/>
+          <w:sz w:val="24"/>
+          <w:szCs w:val="24"/>
+        </w:rPr>
+        <w:t>репозиторий</w:t>
+      </w:r>
+      <w:proofErr w:type="spellEnd"/>
+      <w:r>
+        <w:rPr>
+          <w:rFonts w:ascii="Times New Roman" w:hAnsi="Times New Roman" w:cs="Times New Roman"/>
+          <w:color w:val="000000"/>
+          <w:sz w:val="24"/>
+          <w:szCs w:val="24"/>
+        </w:rPr>
+        <w:t xml:space="preserve"> на </w:t>
+      </w:r>
+      <w:proofErr w:type="spellStart"/>
+      <w:r>
+        <w:rPr>
+          <w:rFonts w:ascii="Times New Roman" w:hAnsi="Times New Roman" w:cs="Times New Roman"/>
+          <w:color w:val="000000"/>
+          <w:sz w:val="24"/>
+          <w:szCs w:val="24"/>
+          <w:lang w:val="en-US"/>
+        </w:rPr>
+        <w:t>Git</w:t>
+      </w:r>
+      <w:proofErr w:type="spellEnd"/>
+      <w:r>
+        <w:rPr>
+          <w:rFonts w:ascii="Times New Roman" w:hAnsi="Times New Roman" w:cs="Times New Roman"/>
+          <w:color w:val="000000"/>
+          <w:sz w:val="24"/>
+          <w:szCs w:val="24"/>
+        </w:rPr>
+        <w:t>.</w:t>
+      </w:r>
+    </w:p>
     <w:sectPr>
-      <w:footerReference w:type="default" r:id="rId26"/>
-      <w:footerReference w:type="first" r:id="rId27"/>
+      <w:footerReference w:type="default" r:id="rId27"/>
+      <w:footerReference w:type="first" r:id="rId28"/>
       <w:pgSz w:w="11906" w:h="16838"/>
       <w:pgMar w:top="1134" w:right="850" w:bottom="1134" w:left="1701" w:header="0" w:footer="708" w:gutter="0"/>
       <w:cols w:space="720"/>
@@ -2873,7 +2928,7 @@
           <w:rPr>
             <w:noProof/>
           </w:rPr>
-          <w:t>5</w:t>
+          <w:t>6</w:t>
         </w:r>
         <w:r>
           <w:fldChar w:fldCharType="end"/>
@@ -3982,7 +4037,7 @@
 </file>
 
 <file path=customXml/itemProps1.xml><?xml version="1.0" encoding="utf-8"?>
-<ds:datastoreItem xmlns:ds="http://schemas.openxmlformats.org/officeDocument/2006/customXml" ds:itemID="{56C9E092-C0E9-4F0C-8050-DF3E62D3D374}">
+<ds:datastoreItem xmlns:ds="http://schemas.openxmlformats.org/officeDocument/2006/customXml" ds:itemID="{7A5A596C-5A21-445F-A1D7-37F041A14534}">
   <ds:schemaRefs>
     <ds:schemaRef ds:uri="http://schemas.openxmlformats.org/officeDocument/2006/bibliography"/>
   </ds:schemaRefs>

</xml_diff>